<commit_message>
docs: Update API documentation and database schema for improved clarity and organization
</commit_message>
<xml_diff>
--- a/docs/API_DOCUMENTATION.docx
+++ b/docs/API_DOCUMENTATION.docx
@@ -28,6 +28,14 @@
     <w:p/>
     <w:sdt>
       <w:sdtPr>
+        <w:rPr>
+          <w:rFonts w:asciiTheme="minorHAnsi" w:eastAsiaTheme="minorEastAsia" w:hAnsiTheme="minorHAnsi" w:cstheme="minorBidi"/>
+          <w:b w:val="0"/>
+          <w:bCs w:val="0"/>
+          <w:color w:val="auto"/>
+          <w:sz w:val="22"/>
+          <w:szCs w:val="22"/>
+        </w:rPr>
         <w:id w:val="555289634"/>
         <w:docPartObj>
           <w:docPartGallery w:val="Table of Contents"/>
@@ -36,11 +44,7 @@
       </w:sdtPr>
       <w:sdtEndPr>
         <w:rPr>
-          <w:rFonts w:asciiTheme="minorHAnsi" w:eastAsiaTheme="minorEastAsia" w:hAnsiTheme="minorHAnsi" w:cstheme="minorBidi"/>
           <w:noProof/>
-          <w:color w:val="auto"/>
-          <w:sz w:val="22"/>
-          <w:szCs w:val="22"/>
         </w:rPr>
       </w:sdtEndPr>
       <w:sdtContent>
@@ -56,6 +60,9 @@
         <w:p>
           <w:pPr>
             <w:pStyle w:val="TOCHeading"/>
+            <w:rPr>
+              <w:noProof/>
+            </w:rPr>
           </w:pPr>
           <w:r>
             <w:fldChar w:fldCharType="begin"/>
@@ -124,7 +131,7 @@
                 <w:noProof/>
                 <w:webHidden/>
               </w:rPr>
-              <w:t>2</w:t>
+              <w:t>1</w:t>
             </w:r>
             <w:r>
               <w:rPr>
@@ -192,7 +199,7 @@
                 <w:noProof/>
                 <w:webHidden/>
               </w:rPr>
-              <w:t>2</w:t>
+              <w:t>1</w:t>
             </w:r>
             <w:r>
               <w:rPr>
@@ -396,7 +403,7 @@
                 <w:noProof/>
                 <w:webHidden/>
               </w:rPr>
-              <w:t>5</w:t>
+              <w:t>4</w:t>
             </w:r>
             <w:r>
               <w:rPr>
@@ -464,7 +471,7 @@
                 <w:noProof/>
                 <w:webHidden/>
               </w:rPr>
-              <w:t>9</w:t>
+              <w:t>7</w:t>
             </w:r>
             <w:r>
               <w:rPr>
@@ -532,7 +539,7 @@
                 <w:noProof/>
                 <w:webHidden/>
               </w:rPr>
-              <w:t>11</w:t>
+              <w:t>8</w:t>
             </w:r>
             <w:r>
               <w:rPr>
@@ -600,7 +607,7 @@
                 <w:noProof/>
                 <w:webHidden/>
               </w:rPr>
-              <w:t>13</w:t>
+              <w:t>10</w:t>
             </w:r>
             <w:r>
               <w:rPr>
@@ -627,21 +634,7 @@
                 <w:rStyle w:val="Hyperlink"/>
                 <w:noProof/>
               </w:rPr>
-              <w:t>Stats Endpo</w:t>
-            </w:r>
-            <w:r>
-              <w:rPr>
-                <w:rStyle w:val="Hyperlink"/>
-                <w:noProof/>
-              </w:rPr>
-              <w:t>i</w:t>
-            </w:r>
-            <w:r>
-              <w:rPr>
-                <w:rStyle w:val="Hyperlink"/>
-                <w:noProof/>
-              </w:rPr>
-              <w:t>nts (Admin Only)</w:t>
+              <w:t>Stats Endpoints (Admin Only)</w:t>
             </w:r>
             <w:r>
               <w:rPr>
@@ -682,7 +675,7 @@
                 <w:noProof/>
                 <w:webHidden/>
               </w:rPr>
-              <w:t>15</w:t>
+              <w:t>11</w:t>
             </w:r>
             <w:r>
               <w:rPr>
@@ -750,7 +743,7 @@
                 <w:noProof/>
                 <w:webHidden/>
               </w:rPr>
-              <w:t>15</w:t>
+              <w:t>12</w:t>
             </w:r>
             <w:r>
               <w:rPr>
@@ -818,7 +811,7 @@
                 <w:noProof/>
                 <w:webHidden/>
               </w:rPr>
-              <w:t>16</w:t>
+              <w:t>12</w:t>
             </w:r>
             <w:r>
               <w:rPr>
@@ -886,7 +879,7 @@
                 <w:noProof/>
                 <w:webHidden/>
               </w:rPr>
-              <w:t>16</w:t>
+              <w:t>13</w:t>
             </w:r>
             <w:r>
               <w:rPr>
@@ -910,48 +903,13 @@
       </w:sdtContent>
     </w:sdt>
     <w:p>
-      <w:pPr>
-        <w:pStyle w:val="Heading2"/>
-      </w:pPr>
       <w:bookmarkStart w:id="1" w:name="_Toc222339811"/>
     </w:p>
     <w:p>
       <w:pPr>
         <w:pStyle w:val="Heading2"/>
       </w:pPr>
-    </w:p>
-    <w:p>
-      <w:pPr>
-        <w:pStyle w:val="Heading2"/>
-      </w:pPr>
-    </w:p>
-    <w:p>
-      <w:pPr>
-        <w:pStyle w:val="Heading2"/>
-      </w:pPr>
-    </w:p>
-    <w:p>
-      <w:pPr>
-        <w:pStyle w:val="Heading2"/>
-      </w:pPr>
-    </w:p>
-    <w:p>
-      <w:pPr>
-        <w:pStyle w:val="Heading2"/>
-      </w:pPr>
-    </w:p>
-    <w:p>
-      <w:pPr>
-        <w:pStyle w:val="Heading2"/>
-      </w:pPr>
-    </w:p>
-    <w:p/>
-    <w:p>
-      <w:pPr>
-        <w:pStyle w:val="Heading2"/>
-      </w:pPr>
-      <w:r>
-        <w:lastRenderedPageBreak/>
+      <w:r>
         <w:t>Base URL</w:t>
       </w:r>
       <w:bookmarkEnd w:id="1"/>
@@ -1001,6 +959,7 @@
       </w:pPr>
       <w:bookmarkStart w:id="3" w:name="_Toc222339813"/>
       <w:r>
+        <w:lastRenderedPageBreak/>
         <w:t>Response Format</w:t>
       </w:r>
       <w:bookmarkEnd w:id="3"/>
@@ -1132,49 +1091,49 @@
       </w:r>
       <w:r>
         <w:br/>
+        <w:t xml:space="preserve">  "data": {</w:t>
+      </w:r>
+      <w:r>
+        <w:br/>
+        <w:t xml:space="preserve">    "user": {</w:t>
+      </w:r>
+      <w:r>
+        <w:br/>
+        <w:t xml:space="preserve">      "id": 1,</w:t>
+      </w:r>
+      <w:r>
+        <w:br/>
+        <w:t xml:space="preserve">      "username": "John Doe",</w:t>
+      </w:r>
+      <w:r>
+        <w:br/>
+        <w:t xml:space="preserve">      "firstName": "John",</w:t>
+      </w:r>
+      <w:r>
+        <w:br/>
+        <w:t xml:space="preserve">      "lastName": "Doe",</w:t>
+      </w:r>
+      <w:r>
+        <w:br/>
+        <w:t xml:space="preserve">      "email": "john@example.com",</w:t>
+      </w:r>
+      <w:r>
+        <w:br/>
+        <w:t xml:space="preserve">      "role": "user",</w:t>
+      </w:r>
+      <w:r>
+        <w:br/>
+        <w:t xml:space="preserve">      "status": "pending",</w:t>
+      </w:r>
+      <w:r>
+        <w:br/>
+        <w:t xml:space="preserve">      "avatarUrl": "https://example.com/avatar.svg"</w:t>
+      </w:r>
+      <w:r>
+        <w:br/>
       </w:r>
       <w:r>
         <w:lastRenderedPageBreak/>
-        <w:t xml:space="preserve">  "data": {</w:t>
-      </w:r>
-      <w:r>
-        <w:br/>
-        <w:t xml:space="preserve">    "user": {</w:t>
-      </w:r>
-      <w:r>
-        <w:br/>
-        <w:t xml:space="preserve">      "id": 1,</w:t>
-      </w:r>
-      <w:r>
-        <w:br/>
-        <w:t xml:space="preserve">      "username": "John Doe",</w:t>
-      </w:r>
-      <w:r>
-        <w:br/>
-        <w:t xml:space="preserve">      "firstName": "John",</w:t>
-      </w:r>
-      <w:r>
-        <w:br/>
-        <w:t xml:space="preserve">      "lastName": "Doe",</w:t>
-      </w:r>
-      <w:r>
-        <w:br/>
-        <w:t xml:space="preserve">      "email": "john@example.com",</w:t>
-      </w:r>
-      <w:r>
-        <w:br/>
-        <w:t xml:space="preserve">      "role": "user",</w:t>
-      </w:r>
-      <w:r>
-        <w:br/>
-        <w:t xml:space="preserve">      "status": "pending",</w:t>
-      </w:r>
-      <w:r>
-        <w:br/>
-        <w:t xml:space="preserve">      "avatarUrl": "https://example.com/avatar.svg"</w:t>
-      </w:r>
-      <w:r>
-        <w:br/>
         <w:t xml:space="preserve">    }</w:t>
       </w:r>
       <w:r>
@@ -1307,7 +1266,6 @@
         <w:br/>
       </w:r>
       <w:r>
-        <w:lastRenderedPageBreak/>
         <w:br/>
         <w:t>Response 200:</w:t>
       </w:r>
@@ -1346,6 +1304,9 @@
       </w:r>
       <w:r>
         <w:br/>
+      </w:r>
+      <w:r>
+        <w:lastRenderedPageBreak/>
         <w:t>{</w:t>
       </w:r>
       <w:r>
@@ -1426,18 +1387,13 @@
         <w:t>{ "message": "Heartbeat recorded" }</w:t>
       </w:r>
     </w:p>
-    <w:p>
-      <w:r>
-        <w:br w:type="page"/>
-      </w:r>
-    </w:p>
+    <w:p/>
     <w:p>
       <w:pPr>
         <w:pStyle w:val="Heading2"/>
       </w:pPr>
       <w:bookmarkStart w:id="10" w:name="_Toc222339820"/>
       <w:r>
-        <w:lastRenderedPageBreak/>
         <w:t>Recipes Endpoints</w:t>
       </w:r>
       <w:bookmarkEnd w:id="10"/>
@@ -1822,6 +1778,7 @@
     </w:tbl>
     <w:p>
       <w:r>
+        <w:lastRenderedPageBreak/>
         <w:t>Response 200:</w:t>
       </w:r>
       <w:r>
@@ -1915,9 +1872,6 @@
       </w:r>
       <w:r>
         <w:br/>
-      </w:r>
-      <w:r>
-        <w:lastRenderedPageBreak/>
         <w:t>Request Body:</w:t>
       </w:r>
       <w:r>
@@ -2005,6 +1959,7 @@
         <w:br/>
       </w:r>
       <w:r>
+        <w:lastRenderedPageBreak/>
         <w:br/>
         <w:t>Response 200:</w:t>
       </w:r>
@@ -2094,9 +2049,6 @@
       </w:r>
       <w:r>
         <w:br/>
-      </w:r>
-      <w:r>
-        <w:lastRenderedPageBreak/>
         <w:t>- Owner edits preserve the recipe's current status by default.</w:t>
       </w:r>
       <w:r>
@@ -2184,6 +2136,7 @@
         <w:br/>
       </w:r>
       <w:r>
+        <w:lastRenderedPageBreak/>
         <w:br/>
         <w:t>Response 200:</w:t>
       </w:r>
@@ -2277,9 +2230,6 @@
       </w:r>
       <w:r>
         <w:br/>
-      </w:r>
-      <w:r>
-        <w:lastRenderedPageBreak/>
         <w:t>Auth Required: Yes</w:t>
       </w:r>
       <w:r>
@@ -2294,18 +2244,13 @@
         <w:t>{ "data": { "viewRecorded": true, "viewCount": 51 } }</w:t>
       </w:r>
     </w:p>
-    <w:p>
-      <w:r>
-        <w:br w:type="page"/>
-      </w:r>
-    </w:p>
+    <w:p/>
     <w:p>
       <w:pPr>
         <w:pStyle w:val="Heading2"/>
       </w:pPr>
       <w:bookmarkStart w:id="20" w:name="_Toc222339830"/>
       <w:r>
-        <w:lastRenderedPageBreak/>
         <w:t>Reviews Endpoints</w:t>
       </w:r>
       <w:bookmarkEnd w:id="20"/>
@@ -2364,6 +2309,9 @@
       </w:r>
       <w:r>
         <w:br/>
+      </w:r>
+      <w:r>
+        <w:lastRenderedPageBreak/>
         <w:t xml:space="preserve">        "user": { "id": 4, "username": "John Doe", "avatarUrl": "..." }</w:t>
       </w:r>
       <w:r>
@@ -2486,7 +2434,6 @@
       </w:pPr>
       <w:bookmarkStart w:id="24" w:name="_Toc222339834"/>
       <w:r>
-        <w:lastRenderedPageBreak/>
         <w:t>DELETE /reviews/{id}</w:t>
       </w:r>
       <w:bookmarkEnd w:id="24"/>
@@ -2514,18 +2461,13 @@
         <w:t>{ "message": "Review deleted" }</w:t>
       </w:r>
     </w:p>
-    <w:p>
-      <w:r>
-        <w:br w:type="page"/>
-      </w:r>
-    </w:p>
+    <w:p/>
     <w:p>
       <w:pPr>
         <w:pStyle w:val="Heading2"/>
       </w:pPr>
       <w:bookmarkStart w:id="25" w:name="_Toc222339835"/>
       <w:r>
-        <w:lastRenderedPageBreak/>
         <w:t>Search Endpoints</w:t>
       </w:r>
       <w:bookmarkEnd w:id="25"/>
@@ -2549,6 +2491,9 @@
       </w:r>
       <w:r>
         <w:br/>
+      </w:r>
+      <w:r>
+        <w:lastRenderedPageBreak/>
         <w:t>Auth Required: Yes</w:t>
       </w:r>
       <w:r>
@@ -2982,7 +2927,6 @@
       </w:pPr>
       <w:bookmarkStart w:id="30" w:name="_Toc222339840"/>
       <w:r>
-        <w:lastRenderedPageBreak/>
         <w:t>DELETE /search/history/{id}</w:t>
       </w:r>
       <w:bookmarkEnd w:id="30"/>
@@ -2999,18 +2943,13 @@
         <w:t>Auth Required: Yes</w:t>
       </w:r>
     </w:p>
-    <w:p>
-      <w:r>
-        <w:br w:type="page"/>
-      </w:r>
-    </w:p>
+    <w:p/>
     <w:p>
       <w:pPr>
         <w:pStyle w:val="Heading2"/>
       </w:pPr>
       <w:bookmarkStart w:id="31" w:name="_Toc222339841"/>
       <w:r>
-        <w:lastRenderedPageBreak/>
         <w:t>Users Endpoints</w:t>
       </w:r>
       <w:bookmarkEnd w:id="31"/>
@@ -3377,6 +3316,9 @@
       </w:r>
       <w:r>
         <w:br/>
+      </w:r>
+      <w:r>
+        <w:lastRenderedPageBreak/>
         <w:t xml:space="preserve">    "cookingLevel": "Intermediate",</w:t>
       </w:r>
       <w:r>
@@ -3385,9 +3327,6 @@
       </w:r>
       <w:r>
         <w:br/>
-      </w:r>
-      <w:r>
-        <w:lastRenderedPageBreak/>
         <w:t xml:space="preserve">    "favorites": [1, 3]</w:t>
       </w:r>
       <w:r>
@@ -3475,18 +3414,13 @@
         <w:t>Audit note: transitions to active/inactive are intentionally excluded from recent admin activity feeds.</w:t>
       </w:r>
     </w:p>
-    <w:p>
-      <w:r>
-        <w:br w:type="page"/>
-      </w:r>
-    </w:p>
+    <w:p/>
     <w:p>
       <w:pPr>
         <w:pStyle w:val="Heading2"/>
       </w:pPr>
       <w:bookmarkStart w:id="37" w:name="_Toc222339847"/>
       <w:r>
-        <w:lastRenderedPageBreak/>
         <w:t>Stats Endpoints (Admin Only)</w:t>
       </w:r>
       <w:bookmarkEnd w:id="37"/>
@@ -3548,6 +3482,9 @@
       </w:r>
       <w:r>
         <w:br/>
+      </w:r>
+      <w:r>
+        <w:lastRenderedPageBreak/>
         <w:t xml:space="preserve">    "contributors": [...],</w:t>
       </w:r>
       <w:r>
@@ -3747,7 +3684,6 @@
         <w:br/>
       </w:r>
       <w:r>
-        <w:lastRenderedPageBreak/>
         <w:br/>
         <w:t>Query Parameters:</w:t>
       </w:r>
@@ -4082,6 +4018,7 @@
           </w:tcPr>
           <w:p>
             <w:r>
+              <w:lastRenderedPageBreak/>
               <w:t>403</w:t>
             </w:r>
           </w:p>

</xml_diff>

<commit_message>
docs: clarify recipe update permissions and status behavior in API documentation
</commit_message>
<xml_diff>
--- a/docs/API_DOCUMENTATION.docx
+++ b/docs/API_DOCUMENTATION.docx
@@ -2024,20 +2024,24 @@
     </w:p>
     <w:p>
       <w:r>
-        <w:t>Update a recipe. Only the recipe owner or an admin can update.</w:t>
-      </w:r>
-      <w:r>
-        <w:br/>
-      </w:r>
-      <w:r>
-        <w:br/>
-        <w:t>Auth Required: Yes (owner or admin)</w:t>
-      </w:r>
-      <w:r>
-        <w:br/>
-      </w:r>
-      <w:r>
-        <w:br/>
+        <w:t>Update a recipe. Only the recipe owner (author) can update.</w:t>
+      </w:r>
+      <w:r>
+        <w:br/>
+      </w:r>
+      <w:r>
+        <w:br/>
+      </w:r>
+      <w:r>
+        <w:t>Auth Required: Yes (recipe owner only)</w:t>
+      </w:r>
+      <w:r>
+        <w:br/>
+      </w:r>
+      <w:r>
+        <w:br/>
+      </w:r>
+      <w:r>
         <w:t>Request Body: Same as POST</w:t>
       </w:r>
       <w:r>
@@ -2045,15 +2049,33 @@
       </w:r>
       <w:r>
         <w:br/>
+      </w:r>
+      <w:r>
         <w:t>Status behavior:</w:t>
       </w:r>
-      <w:r>
-        <w:br/>
-        <w:t>- Owner edits preserve the recipe's current status by default.</w:t>
-      </w:r>
-      <w:r>
-        <w:br/>
-        <w:t>- Admin can set status in the same update request (published, pending, rejected).</w:t>
+    </w:p>
+    <w:p>
+      <w:r>
+        <w:t xml:space="preserve">- </w:t>
+      </w:r>
+      <w:r>
+        <w:t>All recipe edits by the owner automatically change status to 'pending'</w:t>
+      </w:r>
+    </w:p>
+    <w:p>
+      <w:r>
+        <w:t xml:space="preserve">- </w:t>
+      </w:r>
+      <w:r>
+        <w:t>Requires admin reapproval after any edit</w:t>
+      </w:r>
+    </w:p>
+    <w:p>
+      <w:r>
+        <w:t xml:space="preserve">- </w:t>
+      </w:r>
+      <w:r>
+        <w:t>Admins cannot edit recipe content directly (use the /status endpoint instead)</w:t>
       </w:r>
       <w:r>
         <w:br/>
@@ -2064,7 +2086,23 @@
       </w:r>
       <w:r>
         <w:br/>
-        <w:t>{ "data": { ... updated recipe } }</w:t>
+        <w:t xml:space="preserve">{ "data": </w:t>
+      </w:r>
+      <w:proofErr w:type="gramStart"/>
+      <w:r>
+        <w:t>{ ...</w:t>
+      </w:r>
+      <w:proofErr w:type="gramEnd"/>
+      <w:r>
+        <w:t xml:space="preserve"> updated </w:t>
+      </w:r>
+      <w:proofErr w:type="gramStart"/>
+      <w:r>
+        <w:t>recipe }</w:t>
+      </w:r>
+      <w:proofErr w:type="gramEnd"/>
+      <w:r>
+        <w:t xml:space="preserve"> }</w:t>
       </w:r>
     </w:p>
     <w:p>
@@ -2073,7 +2111,15 @@
       </w:pPr>
       <w:bookmarkStart w:id="15" w:name="_Toc222339825"/>
       <w:r>
-        <w:t>DELETE /recipes/{id}</w:t>
+        <w:t>DELETE /</w:t>
+      </w:r>
+      <w:proofErr w:type="gramStart"/>
+      <w:r>
+        <w:t>recipes/{</w:t>
+      </w:r>
+      <w:proofErr w:type="gramEnd"/>
+      <w:r>
+        <w:t>id}</w:t>
       </w:r>
       <w:bookmarkEnd w:id="15"/>
     </w:p>
@@ -2125,6 +2171,7 @@
         <w:br/>
       </w:r>
       <w:r>
+        <w:lastRenderedPageBreak/>
         <w:br/>
         <w:t>Request Body:</w:t>
       </w:r>
@@ -2136,7 +2183,6 @@
         <w:br/>
       </w:r>
       <w:r>
-        <w:lastRenderedPageBreak/>
         <w:br/>
         <w:t>Response 200:</w:t>
       </w:r>
@@ -2297,6 +2343,9 @@
       </w:r>
       <w:r>
         <w:br/>
+      </w:r>
+      <w:r>
+        <w:lastRenderedPageBreak/>
         <w:t xml:space="preserve">      {</w:t>
       </w:r>
       <w:r>
@@ -2309,9 +2358,6 @@
       </w:r>
       <w:r>
         <w:br/>
-      </w:r>
-      <w:r>
-        <w:lastRenderedPageBreak/>
         <w:t xml:space="preserve">        "user": { "id": 4, "username": "John Doe", "avatarUrl": "..." }</w:t>
       </w:r>
       <w:r>
@@ -2468,6 +2514,7 @@
       </w:pPr>
       <w:bookmarkStart w:id="25" w:name="_Toc222339835"/>
       <w:r>
+        <w:lastRenderedPageBreak/>
         <w:t>Search Endpoints</w:t>
       </w:r>
       <w:bookmarkEnd w:id="25"/>
@@ -2491,9 +2538,6 @@
       </w:r>
       <w:r>
         <w:br/>
-      </w:r>
-      <w:r>
-        <w:lastRenderedPageBreak/>
         <w:t>Auth Required: Yes</w:t>
       </w:r>
       <w:r>
@@ -2927,6 +2971,7 @@
       </w:pPr>
       <w:bookmarkStart w:id="30" w:name="_Toc222339840"/>
       <w:r>
+        <w:lastRenderedPageBreak/>
         <w:t>DELETE /search/history/{id}</w:t>
       </w:r>
       <w:bookmarkEnd w:id="30"/>
@@ -3296,6 +3341,9 @@
       </w:r>
       <w:r>
         <w:br/>
+      </w:r>
+      <w:r>
+        <w:lastRenderedPageBreak/>
         <w:t xml:space="preserve">  "message": "Profile updated",</w:t>
       </w:r>
       <w:r>
@@ -3316,9 +3364,6 @@
       </w:r>
       <w:r>
         <w:br/>
-      </w:r>
-      <w:r>
-        <w:lastRenderedPageBreak/>
         <w:t xml:space="preserve">    "cookingLevel": "Intermediate",</w:t>
       </w:r>
       <w:r>
@@ -3462,6 +3507,9 @@
       </w:r>
       <w:r>
         <w:br/>
+      </w:r>
+      <w:r>
+        <w:lastRenderedPageBreak/>
         <w:t>{</w:t>
       </w:r>
       <w:r>
@@ -3482,9 +3530,6 @@
       </w:r>
       <w:r>
         <w:br/>
-      </w:r>
-      <w:r>
-        <w:lastRenderedPageBreak/>
         <w:t xml:space="preserve">    "contributors": [...],</w:t>
       </w:r>
       <w:r>
@@ -3887,6 +3932,7 @@
       </w:pPr>
       <w:bookmarkStart w:id="42" w:name="_Toc222339852"/>
       <w:r>
+        <w:lastRenderedPageBreak/>
         <w:t>Error Codes</w:t>
       </w:r>
       <w:bookmarkEnd w:id="42"/>
@@ -4018,7 +4064,6 @@
           </w:tcPr>
           <w:p>
             <w:r>
-              <w:lastRenderedPageBreak/>
               <w:t>403</w:t>
             </w:r>
           </w:p>
@@ -4966,7 +5011,6 @@
   <w:style w:type="character" w:default="1" w:styleId="DefaultParagraphFont">
     <w:name w:val="Default Paragraph Font"/>
     <w:uiPriority w:val="1"/>
-    <w:semiHidden/>
     <w:unhideWhenUsed/>
   </w:style>
   <w:style w:type="table" w:default="1" w:styleId="TableNormal">

</xml_diff>